<commit_message>
test(organization): perbarui uji level jabatan organisasi untuk staf ahli dan template naskah
</commit_message>
<xml_diff>
--- a/public/templates/template-surat-dinas-bagian.docx
+++ b/public/templates/template-surat-dinas-bagian.docx
@@ -1,7 +1,6 @@
 
-<file path=word/document.xml><?xml version="1.0" encoding="UTF-8" standalone="yes"?>
-<w:document xmlns:w="http://schemas.openxmlformats.org/wordprocessingml/2006/main"
-            xmlns:r="http://schemas.openxmlformats.org/officeDocument/2006/relationships">
+<file path=word/document.xml><?xml version="1.0" encoding="utf-8"?>
+<w:document xmlns:w="http://schemas.openxmlformats.org/wordprocessingml/2006/main" xmlns:r="http://schemas.openxmlformats.org/officeDocument/2006/relationships">
   <w:body>
     <!-- KOP SURAT PEMERINTAH KOTA & BAGIAN -->
     <w:p>
@@ -72,10 +71,9 @@
           <w:sz w:val="18"/>
           <w:szCs w:val="18"/>
         </w:rPr>
-        <w:t>Laman: www.baubaukota.go.id &bull; Pos-el: bagian.umum@baubaukota.go.id</w:t>
-      </w:r>
-    </w:p>
-
+        <w:t>Laman: www.baubaukota.go.id • Pos-el: bagian.umum@baubaukota.go.id</w:t>
+      </w:r>
+    </w:p>
     <!-- HEADER DATA SURAT (Tabel Tanpa Garis: Nomor/Sifat/Lampiran di Kiri, Tanggal di Kanan) -->
     <w:tbl>
       <w:tblPr>
@@ -96,52 +94,159 @@
         <w:gridCol w:w="3600"/>
       </w:tblGrid>
       <w:tr>
-        <w:tc><w:p><w:r><w:t>Nomor</w:t></w:r></w:p></w:tc>
-        <w:tc><w:p><w:r><w:t>:</w:t></w:r></w:p></w:tc>
-        <w:tc><w:p><w:r><w:b/><w:t>000 / [NO_AGENDA] / SETDA / 2026</w:t></w:r></w:p></w:tc>
-        <w:tc><w:p><w:pPr><w:jc w:val="right"/></w:pPr><w:r><w:t>Baubau, [Tanggal]</w:t></w:r></w:p></w:tc>
+        <w:tc>
+          <w:p>
+            <w:r>
+              <w:t>Nomor</w:t>
+            </w:r>
+          </w:p>
+        </w:tc>
+        <w:tc>
+          <w:p>
+            <w:r>
+              <w:t>:</w:t>
+            </w:r>
+          </w:p>
+        </w:tc>
+        <w:tc>
+          <w:p>
+            <w:r>
+              <w:b/>
+              <w:t>000 / [NO_AGENDA] / SETDA / 2026</w:t>
+            </w:r>
+          </w:p>
+        </w:tc>
+        <w:tc>
+          <w:p>
+            <w:pPr>
+              <w:jc w:val="right"/>
+            </w:pPr>
+            <w:r>
+              <w:t>Baubau, [Tanggal]</w:t>
+            </w:r>
+          </w:p>
+        </w:tc>
       </w:tr>
       <w:tr>
-        <w:tc><w:p><w:r><w:t>Sifat</w:t></w:r></w:p></w:tc>
-        <w:tc><w:p><w:r><w:t>:</w:t></w:r></w:p></w:tc>
-        <w:tc><w:p><w:r><w:t>Biasa / Segera</w:t></w:r></w:p></w:tc>
-        <w:tc><w:p/></w:tc>
+        <w:tc>
+          <w:p>
+            <w:r>
+              <w:t>Sifat</w:t>
+            </w:r>
+          </w:p>
+        </w:tc>
+        <w:tc>
+          <w:p>
+            <w:r>
+              <w:t>:</w:t>
+            </w:r>
+          </w:p>
+        </w:tc>
+        <w:tc>
+          <w:p>
+            <w:r>
+              <w:t>Biasa / Segera</w:t>
+            </w:r>
+          </w:p>
+        </w:tc>
+        <w:tc>
+          <w:p/>
+        </w:tc>
       </w:tr>
       <w:tr>
-        <w:tc><w:p><w:r><w:t>Lampiran</w:t></w:r></w:p></w:tc>
-        <w:tc><w:p><w:r><w:t>:</w:t></w:r></w:p></w:tc>
-        <w:tc><w:p><w:r><w:t>- (Satu Berkas)</w:t></w:r></w:p></w:tc>
-        <w:tc><w:p/></w:tc>
+        <w:tc>
+          <w:p>
+            <w:r>
+              <w:t>Lampiran</w:t>
+            </w:r>
+          </w:p>
+        </w:tc>
+        <w:tc>
+          <w:p>
+            <w:r>
+              <w:t>:</w:t>
+            </w:r>
+          </w:p>
+        </w:tc>
+        <w:tc>
+          <w:p>
+            <w:r>
+              <w:t>- (Satu Berkas)</w:t>
+            </w:r>
+          </w:p>
+        </w:tc>
+        <w:tc>
+          <w:p/>
+        </w:tc>
       </w:tr>
       <w:tr>
-        <w:tc><w:p><w:r><w:t>Perihal</w:t></w:r></w:p></w:tc>
-        <w:tc><w:p><w:r><w:t>:</w:t></w:r></w:p></w:tc>
-        <w:tc><w:p><w:r><w:b/><w:t>[Perihal Surat / Tanggapan Resmi]</w:t></w:r></w:p></w:tc>
-        <w:tc><w:p/></w:tc>
+        <w:tc>
+          <w:p>
+            <w:r>
+              <w:t>Perihal</w:t>
+            </w:r>
+          </w:p>
+        </w:tc>
+        <w:tc>
+          <w:p>
+            <w:r>
+              <w:t>:</w:t>
+            </w:r>
+          </w:p>
+        </w:tc>
+        <w:tc>
+          <w:p>
+            <w:r>
+              <w:b/>
+              <w:t>[Perihal Surat / Tanggapan Resmi]</w:t>
+            </w:r>
+          </w:p>
+        </w:tc>
+        <w:tc>
+          <w:p/>
+        </w:tc>
       </w:tr>
     </w:tbl>
-
     <!-- SPASI -->
-    <w:p><w:pPr><w:spacing w:before="120" w:after="60"/></w:pPr></w:p>
-
+    <w:p>
+      <w:pPr>
+        <w:spacing w:before="120" w:after="60"/>
+      </w:pPr>
+    </w:p>
     <!-- KEPADA YTH -->
     <w:p>
-      <w:pPr><w:spacing w:before="60" w:after="20"/></w:pPr>
-      <w:r><w:t>Kepada</w:t></w:r>
-    </w:p>
-    <w:p>
-      <w:pPr><w:spacing w:before="0" w:after="20"/></w:pPr>
-      <w:r><w:t>Yth. [Nama Jabatan / Instansi Tujuan]</w:t></w:r>
-    </w:p>
-    <w:p>
-      <w:pPr><w:spacing w:before="0" w:after="20"/></w:pPr>
-      <w:r><w:t>di &ndash;</w:t></w:r>
-    </w:p>
-    <w:p>
-      <w:pPr><w:spacing w:before="0" w:after="160"/><w:ind w:left="400"/></w:pPr>
-      <w:r><w:t>Tempat</w:t></w:r>
-    </w:p>
-
+      <w:pPr>
+        <w:spacing w:before="60" w:after="20"/>
+      </w:pPr>
+      <w:r>
+        <w:t>Kepada</w:t>
+      </w:r>
+    </w:p>
+    <w:p>
+      <w:pPr>
+        <w:spacing w:before="0" w:after="20"/>
+      </w:pPr>
+      <w:r>
+        <w:t>Yth. [Nama Jabatan / Instansi Tujuan]</w:t>
+      </w:r>
+    </w:p>
+    <w:p>
+      <w:pPr>
+        <w:spacing w:before="0" w:after="20"/>
+      </w:pPr>
+      <w:r>
+        <w:t>di -</w:t>
+      </w:r>
+    </w:p>
+    <w:p>
+      <w:pPr>
+        <w:spacing w:before="0" w:after="160"/>
+        <w:ind w:left="400"/>
+      </w:pPr>
+      <w:r>
+        <w:t>Tempat</w:t>
+      </w:r>
+    </w:p>
     <!-- ISI SURAT (PARAGRAF PEMBUKA) -->
     <w:p>
       <w:pPr>
@@ -153,7 +258,6 @@
         <w:t>Berdasarkan rujukan permohonan koordinasi Nomor: [Nomor_Surat_Pengirim] tanggal [Tanggal_Surat_Pengirim] perihal [Perihal_Surat_Pengirim], serta tindak lanjut hasil telaah dan koordinasi teknis perangkat daerah terkait, bersama ini disampaikan beberapa hal sebagai berikut:</w:t>
       </w:r>
     </w:p>
-
     <!-- ISI SURAT (POIN-POIN BATANG TUBUH) -->
     <w:p>
       <w:pPr>
@@ -161,8 +265,12 @@
         <w:spacing w:before="0" w:after="80" w:line="276" w:lineRule="auto"/>
         <w:ind w:left="567" w:hanging="400"/>
       </w:pPr>
-      <w:r><w:t>1. </w:t></w:r>
-      <w:r><w:t>Pemerintah Kota Baubau melalui Bagian terkait menyambut baik dan mendukung terlaksananya program pengembangan yang diusulkan demi peningkatan pelayanan dan kesejahteraan masyarakat;</w:t></w:r>
+      <w:r>
+        <w:t>1. </w:t>
+      </w:r>
+      <w:r>
+        <w:t>Pemerintah Kota Baubau melalui Bagian terkait menyambut baik dan mendukung terlaksananya program pengembangan yang diusulkan demi peningkatan pelayanan dan kesejahteraan masyarakat;</w:t>
+      </w:r>
     </w:p>
     <w:p>
       <w:pPr>
@@ -170,8 +278,12 @@
         <w:spacing w:before="0" w:after="80" w:line="276" w:lineRule="auto"/>
         <w:ind w:left="567" w:hanging="400"/>
       </w:pPr>
-      <w:r><w:t>2. </w:t></w:r>
-      <w:r><w:t>Sehubungan dengan kesiapan teknis dan kelengkapan administrasi, dimohon kerja sama Saudara untuk mengoordinasikan jadwal peninjauan lapangan bersama tim teknis perangkat daerah terkait;</w:t></w:r>
+      <w:r>
+        <w:t>2. </w:t>
+      </w:r>
+      <w:r>
+        <w:t>Sehubungan dengan kesiapan teknis dan kelengkapan administrasi, dimohon kerja sama Saudara untuk mengoordinasikan jadwal peninjauan lapangan bersama tim teknis perangkat daerah terkait;</w:t>
+      </w:r>
     </w:p>
     <w:p>
       <w:pPr>
@@ -179,10 +291,13 @@
         <w:spacing w:before="0" w:after="140" w:line="276" w:lineRule="auto"/>
         <w:ind w:left="567" w:hanging="400"/>
       </w:pPr>
-      <w:r><w:t>3. </w:t></w:r>
-      <w:r><w:t>Hal-hal teknis mengenai tindak lanjut operasional dapat dikonsultasikan secara berkala melalui narahubung Bagian Umum Sekretariat Daerah Kota Baubau.</w:t></w:r>
-    </w:p>
-
+      <w:r>
+        <w:t>3. </w:t>
+      </w:r>
+      <w:r>
+        <w:t>Hal-hal teknis mengenai tindak lanjut operasional dapat dikonsultasikan secara berkala melalui narahubung Bagian Umum Sekretariat Daerah Kota Baubau.</w:t>
+      </w:r>
+    </w:p>
     <!-- PARAGRAF PENUTUP -->
     <w:p>
       <w:pPr>
@@ -194,7 +309,6 @@
         <w:t>Demikian surat ini disampaikan untuk menjadi maklum dan dipergunakan sebagaimana mestinya. Atas perhatian dan kerja samanya, diucapkan terima kasih.</w:t>
       </w:r>
     </w:p>
-
     <!-- BLOK TANDA TANGAN (DI BAWAH KANAN) -->
     <!-- Menggunakan tabel 2 kolom: Kiri 5000 dxa (kosong), Kanan 4600 dxa (Blok Tanda Tangan) -->
     <w:tbl>
@@ -216,7 +330,11 @@
       <w:tr>
         <!-- Kolom Kiri: Kosong (Area Aman) -->
         <w:tc>
-          <w:p><w:pPr><w:spacing w:before="0" w:after="0"/></w:pPr></w:p>
+          <w:p>
+            <w:pPr>
+              <w:spacing w:before="0" w:after="0"/>
+            </w:pPr>
+          </w:p>
         </w:tc>
         <!-- Kolom Kanan: Kuadran Kanan Bawah (Area Tanda Tangan & QR Code) -->
         <w:tc>
@@ -293,14 +411,17 @@
         </w:tc>
       </w:tr>
     </w:tbl>
-
     <!-- TEMBUSAN (POJOK KIRI BAWAH) -->
     <w:p>
       <w:pPr>
         <w:spacing w:before="240" w:after="40"/>
       </w:pPr>
       <w:r>
-        <w:rPr><w:sz w:val="18"/><w:szCs w:val="18"/><w:u w:val="single"/></w:rPr>
+        <w:rPr>
+          <w:sz w:val="18"/>
+          <w:szCs w:val="18"/>
+          <w:u w:val="single"/>
+        </w:rPr>
         <w:t>Tembusan Yth:</w:t>
       </w:r>
     </w:p>
@@ -310,7 +431,10 @@
         <w:ind w:left="200"/>
       </w:pPr>
       <w:r>
-        <w:rPr><w:sz w:val="18"/><w:szCs w:val="18"/></w:rPr>
+        <w:rPr>
+          <w:sz w:val="18"/>
+          <w:szCs w:val="18"/>
+        </w:rPr>
         <w:t>1. Wali Kota Baubau (sebagai laporan);</w:t>
       </w:r>
     </w:p>
@@ -320,7 +444,10 @@
         <w:ind w:left="200"/>
       </w:pPr>
       <w:r>
-        <w:rPr><w:sz w:val="18"/><w:szCs w:val="18"/></w:rPr>
+        <w:rPr>
+          <w:sz w:val="18"/>
+          <w:szCs w:val="18"/>
+        </w:rPr>
         <w:t>2. Sekretaris Daerah Kota Baubau;</w:t>
       </w:r>
     </w:p>
@@ -330,7 +457,10 @@
         <w:ind w:left="200"/>
       </w:pPr>
       <w:r>
-        <w:rPr><w:sz w:val="18"/><w:szCs w:val="18"/></w:rPr>
+        <w:rPr>
+          <w:sz w:val="18"/>
+          <w:szCs w:val="18"/>
+        </w:rPr>
         <w:t>3. Asisten Administrasi Umum Setda Kota Baubau;</w:t>
       </w:r>
     </w:p>
@@ -340,14 +470,17 @@
         <w:ind w:left="200"/>
       </w:pPr>
       <w:r>
-        <w:rPr><w:sz w:val="18"/><w:szCs w:val="18"/></w:rPr>
+        <w:rPr>
+          <w:sz w:val="18"/>
+          <w:szCs w:val="18"/>
+        </w:rPr>
         <w:t>4. Pertinggal / Arsip.</w:t>
       </w:r>
     </w:p>
-
     <!-- SECTION PROPERTIES (MARGIN A4 STANDAR KEDINASAN) -->
     <w:sectPr>
-      <w:pgSz w:w="11906" w:h="16838"/> <!-- A4 Size in twips -->
+      <w:pgSz w:w="11906" w:h="16838"/>
+      <!-- A4 Size in twips -->
       <w:pgMar w:top="1440" w:right="1440" w:bottom="1440" w:left="1440" w:header="720" w:footer="720" w:gutter="0"/>
     </w:sectPr>
   </w:body>

</xml_diff>